<commit_message>
Introduction: sharpen the evolutionary-history framing, restore the second-difficulty marker
Co-Authored-By: Claude Opus 5 <noreply@anthropic.com>
</commit_message>
<xml_diff>
--- a/MANUSCRIPT.docx
+++ b/MANUSCRIPT.docx
@@ -130,7 +130,7 @@
           <w:i w:val="0"/>
           <w:sz w:val="22"/>
         </w:rPr>
-        <w:t>The antibody-antigen interface occupies an unusual position in structural biology. It is among the most intensively solved classes of protein complex, but it is also the least evolutionarily conserved [22, 25]. The production of antibodies revolves around a germline repertoire, diversified by somatic hypermutation, which produces binders against surfaces that have no evolutionary history of being bound [26]. This is the opposite of the situation in an obligate oligomer or an enzyme-inhibitor pair, where both partners have been shaped by selection acting on the interface itself [9, 14]. The question that follows is simple to state but surprisingly hard to answer. When an antibody reads a protein surface, does it use the same chemical rules that co-evolved partners use?</w:t>
+        <w:t>The antibody-antigen interface occupies an unusual position in structural biology. It is among the most intensively solved classes of protein complex, but the pairing itself has no evolutionary history [22, 25]. The production of antibodies revolves around a germline repertoire, diversified by somatic hypermutation, which produces binders against surfaces that have never been selected for binding [26]. This is the opposite of the situation in an obligate oligomer or an enzyme-inhibitor pair, where both partners have been shaped by selection acting on the interface itself [9, 14]. The question that follows is simple to state but surprisingly hard to answer. When an antibody reads a protein surface, does it use the same chemical rules that co-evolved partners use?</w:t>
       </w:r>
     </w:p>
     <w:p>
@@ -172,7 +172,7 @@
           <w:i w:val="0"/>
           <w:sz w:val="22"/>
         </w:rPr>
-        <w:t>Additionally, antibody paratopes are formed by hypervariable loops [13, 16], and antibody antigens are drawn disproportionately from beta-rich viral surface proteins. Any chemical difference between antibody and general interfaces could therefore reflect what is being bound rather than how it is being bound. This confound is widely acknowledged and seldom tested. Testing it requires comparing the two classes within matched structural context, and it requires a null model for that comparison, because restricting data to a matched stratum reduces sample size and attenuates correlations for purely statistical reasons.</w:t>
+        <w:t>A second difficulty is more conceptual. Antibody paratopes are formed by hypervariable loops [13, 16], and antibody antigens are drawn disproportionately from beta-rich viral surface proteins. Any chemical difference between antibody and general interfaces could therefore reflect what is being bound rather than how it is being bound. This confound is widely acknowledged and seldom tested. Testing it requires comparing the two classes within matched structural context, and it requires a null model for that comparison, because restricting data to a matched stratum reduces sample size and attenuates correlations for purely statistical reasons.</w:t>
       </w:r>
     </w:p>
     <w:p>
@@ -186,7 +186,7 @@
           <w:i w:val="0"/>
           <w:sz w:val="22"/>
         </w:rPr>
-        <w:t>In this paper, we addressed both difficulties directly, the missing comparator and the structural confound. A single extraction pipeline was applied to antibody-antigen and general protein-protein complexes, and all statistics were weighted over independence units defined by 30 percent sequence identity clustering of the bound protein. Every stratified comparison was benchmarked against a null drawn at the same sample size. We then asked three questions in sequence. First, what physical forces hold each interface class together. Second, whether the residue-pair preferences, which we refer to as the recognition grammar, are the same in both classes. Third, if they differ, whether the difference can be attributed to structural context, and where it cannot, which chemistry is responsible.</w:t>
+        <w:t>In this paper, we addressed both difficulties directly. A single extraction pipeline was applied to antibody-antigen and general protein-protein complexes, and all statistics were weighted over independence units defined by 30 percent sequence identity clustering of the bound protein. Every stratified comparison was benchmarked against a null drawn at the same sample size. We then asked three questions in sequence. First, what physical forces hold each interface class together. Second, whether the residue-pair preferences, which we refer to as the recognition grammar, are the same in both classes. Third, if they differ, whether the difference can be attributed to structural context, and where it cannot, which chemistry is responsible.</w:t>
       </w:r>
     </w:p>
     <w:p>

</xml_diff>